<commit_message>
feat: adiciona seção de guias na home e destaque Brasil+EUA
Nova seção "Guias sobre Visto Americano" na Home com 8 cards de
acesso rápido às LPs principais, sem criar páginas novas. Adiciona
item institucional "Suporte no Brasil e nos EUA" em Por que Costa &
Souza. Atualiza o documento de resumo para o cliente.
</commit_message>
<xml_diff>
--- a/docs/Costa-Souza-Resumo-LPs.docx
+++ b/docs/Costa-Souza-Resumo-LPs.docx
@@ -84,7 +84,7 @@
         </w:numPr>
         <w:spacing w:after="60"/>
       </w:pPr>
-      <w:hyperlink w:history="1" r:id="rIdtrn9a4apljnmp-zedw2og">
+      <w:hyperlink w:history="1" r:id="rIdg2lp1rqjo6dhixjhmkzev">
         <w:r>
           <w:rPr>
             <w:color w:val="1155CC"/>
@@ -105,7 +105,7 @@
         </w:numPr>
         <w:spacing w:after="60"/>
       </w:pPr>
-      <w:hyperlink w:history="1" r:id="rIdbvtxij2t9midzspr16jdp">
+      <w:hyperlink w:history="1" r:id="rIdhy8kt0lyhxbnukvylnsi9">
         <w:r>
           <w:rPr>
             <w:color w:val="1155CC"/>
@@ -126,7 +126,7 @@
         </w:numPr>
         <w:spacing w:after="60"/>
       </w:pPr>
-      <w:hyperlink w:history="1" r:id="rIduhuwpnbc8ysqqbmkd37rm">
+      <w:hyperlink w:history="1" r:id="rIda3j-qellr5iwritdsrikq">
         <w:r>
           <w:rPr>
             <w:color w:val="1155CC"/>
@@ -147,7 +147,7 @@
         </w:numPr>
         <w:spacing w:after="60"/>
       </w:pPr>
-      <w:hyperlink w:history="1" r:id="rId9y83k1rgzazut_6o34nce">
+      <w:hyperlink w:history="1" r:id="rIdbl9qt6rji6epjrolkylqt">
         <w:r>
           <w:rPr>
             <w:color w:val="1155CC"/>
@@ -168,7 +168,7 @@
         </w:numPr>
         <w:spacing w:after="60"/>
       </w:pPr>
-      <w:hyperlink w:history="1" r:id="rIdqicccnz06_cgyez8wq8g1">
+      <w:hyperlink w:history="1" r:id="rIdwqcslfskjusupfibuk4bs">
         <w:r>
           <w:rPr>
             <w:color w:val="1155CC"/>
@@ -189,7 +189,7 @@
         </w:numPr>
         <w:spacing w:after="60"/>
       </w:pPr>
-      <w:hyperlink w:history="1" r:id="rIdoyoj8l08irungg5otkusv">
+      <w:hyperlink w:history="1" r:id="rIdksm0olp11vddlbicx66y8">
         <w:r>
           <w:rPr>
             <w:color w:val="1155CC"/>
@@ -210,7 +210,7 @@
         </w:numPr>
         <w:spacing w:after="60"/>
       </w:pPr>
-      <w:hyperlink w:history="1" r:id="rId4nj7cxutymvuitxelps9n">
+      <w:hyperlink w:history="1" r:id="rIdlgz3ap0djzltjiduvlygc">
         <w:r>
           <w:rPr>
             <w:color w:val="1155CC"/>
@@ -231,7 +231,7 @@
         </w:numPr>
         <w:spacing w:after="60"/>
       </w:pPr>
-      <w:hyperlink w:history="1" r:id="rIdorr8l4zb3xshkqkyinso0">
+      <w:hyperlink w:history="1" r:id="rIduag9mfmy6hckqu1vqrut3">
         <w:r>
           <w:rPr>
             <w:color w:val="1155CC"/>
@@ -252,7 +252,7 @@
         </w:numPr>
         <w:spacing w:after="60"/>
       </w:pPr>
-      <w:hyperlink w:history="1" r:id="rIdxewax-zqqwgvutykrkz3b">
+      <w:hyperlink w:history="1" r:id="rId0_xiqx_ucxvi0lk_5pe4y">
         <w:r>
           <w:rPr>
             <w:color w:val="1155CC"/>
@@ -273,7 +273,7 @@
         </w:numPr>
         <w:spacing w:after="60"/>
       </w:pPr>
-      <w:hyperlink w:history="1" r:id="rId0ojjdvs1zp_ognaox4elq">
+      <w:hyperlink w:history="1" r:id="rIdz5gxae8azsb91zjincozt">
         <w:r>
           <w:rPr>
             <w:color w:val="1155CC"/>
@@ -294,7 +294,7 @@
         </w:numPr>
         <w:spacing w:after="60"/>
       </w:pPr>
-      <w:hyperlink w:history="1" r:id="rIde_qllqfbz7ufkvfnptm7a">
+      <w:hyperlink w:history="1" r:id="rIdk3xf83cki6dz0sp4r_8ix">
         <w:r>
           <w:rPr>
             <w:color w:val="1155CC"/>
@@ -315,7 +315,7 @@
         </w:numPr>
         <w:spacing w:after="60"/>
       </w:pPr>
-      <w:hyperlink w:history="1" r:id="rId08m6cn2fhgelobxcchpuf">
+      <w:hyperlink w:history="1" r:id="rIdbwckgo8eoh9wsnxnocale">
         <w:r>
           <w:rPr>
             <w:color w:val="1155CC"/>
@@ -336,7 +336,7 @@
         </w:numPr>
         <w:spacing w:after="60"/>
       </w:pPr>
-      <w:hyperlink w:history="1" r:id="rIdzni7nv9koynjdrc0iaqkh">
+      <w:hyperlink w:history="1" r:id="rIdwuvhxbofrm2nrlx8nswdc">
         <w:r>
           <w:rPr>
             <w:color w:val="1155CC"/>
@@ -357,7 +357,7 @@
         </w:numPr>
         <w:spacing w:after="60"/>
       </w:pPr>
-      <w:hyperlink w:history="1" r:id="rIdenwgijbf3ewl-ixokfjqc">
+      <w:hyperlink w:history="1" r:id="rIdvtcohudjkqz-4z8fyzs8i">
         <w:r>
           <w:rPr>
             <w:color w:val="1155CC"/>
@@ -378,7 +378,7 @@
         </w:numPr>
         <w:spacing w:after="60"/>
       </w:pPr>
-      <w:hyperlink w:history="1" r:id="rIdkggrdol0gathenzv7oon7">
+      <w:hyperlink w:history="1" r:id="rIdmzu0ej7nk79ttzg9y8_z8">
         <w:r>
           <w:rPr>
             <w:color w:val="1155CC"/>
@@ -403,7 +403,7 @@
         <w:pStyle w:val="Heading2"/>
         <w:spacing w:after="120" w:before="320"/>
       </w:pPr>
-      <w:hyperlink w:history="1" r:id="rIduok11rlz82vwfpp-8x0p4">
+      <w:hyperlink w:history="1" r:id="rIdasbuzcawez5ffyh224dyk">
         <w:r>
           <w:rPr>
             <w:b/>
@@ -515,24 +515,58 @@
           <w:sz w:val="20"/>
           <w:szCs w:val="20"/>
         </w:rPr>
-        <w:t xml:space="preserve">Cards de 'Serviços' agora linkam para páginas reais (antes iam todos para o botão de contato).</w:t>
-      </w:r>
-    </w:p>
-    <w:p>
-      <w:pPr>
-        <w:pStyle w:val="ListParagraph"/>
-        <w:numPr>
-          <w:ilvl w:val="0"/>
-          <w:numId w:val="2"/>
-        </w:numPr>
-        <w:spacing w:after="60"/>
-      </w:pPr>
-      <w:r>
-        <w:rPr>
-          <w:sz w:val="20"/>
-          <w:szCs w:val="20"/>
-        </w:rPr>
-        <w:t xml:space="preserve">Rodapé com lista de todas as LPs do site ('Guias sobre o visto').</w:t>
+        <w:t xml:space="preserve">Cards de 'Serviços' linkam para páginas reais e específicas (turismo/negócios, renovação, 214(b), estudante).</w:t>
+      </w:r>
+    </w:p>
+    <w:p>
+      <w:pPr>
+        <w:pStyle w:val="ListParagraph"/>
+        <w:numPr>
+          <w:ilvl w:val="0"/>
+          <w:numId w:val="2"/>
+        </w:numPr>
+        <w:spacing w:after="60"/>
+      </w:pPr>
+      <w:r>
+        <w:rPr>
+          <w:sz w:val="20"/>
+          <w:szCs w:val="20"/>
+        </w:rPr>
+        <w:t xml:space="preserve">Seção 'Guias sobre Visto Americano': 8 cards de acesso rápido às principais LPs, direto na Home.</w:t>
+      </w:r>
+    </w:p>
+    <w:p>
+      <w:pPr>
+        <w:pStyle w:val="ListParagraph"/>
+        <w:numPr>
+          <w:ilvl w:val="0"/>
+          <w:numId w:val="2"/>
+        </w:numPr>
+        <w:spacing w:after="60"/>
+      </w:pPr>
+      <w:r>
+        <w:rPr>
+          <w:sz w:val="20"/>
+          <w:szCs w:val="20"/>
+        </w:rPr>
+        <w:t xml:space="preserve">Item institucional 'Suporte no Brasil e nos EUA', reforçando a atuação em ambos os países.</w:t>
+      </w:r>
+    </w:p>
+    <w:p>
+      <w:pPr>
+        <w:pStyle w:val="ListParagraph"/>
+        <w:numPr>
+          <w:ilvl w:val="0"/>
+          <w:numId w:val="2"/>
+        </w:numPr>
+        <w:spacing w:after="60"/>
+      </w:pPr>
+      <w:r>
+        <w:rPr>
+          <w:sz w:val="20"/>
+          <w:szCs w:val="20"/>
+        </w:rPr>
+        <w:t xml:space="preserve">Rodapé com lista de todas as LPs do site.</w:t>
       </w:r>
     </w:p>
     <w:p>
@@ -559,7 +593,7 @@
           <w:sz w:val="20"/>
           <w:szCs w:val="20"/>
         </w:rPr>
-        <w:t xml:space="preserve">Antes, a Home não linkava para nenhuma LP em lugar nenhum — isolava as páginas que mais convertem. Agora ela distribui autoridade para o cluster inteiro.</w:t>
+        <w:t xml:space="preserve">A Home reúne autoridade de marca e distribui essa autoridade para o cluster inteiro — sem competir por palavras-chave específicas de cada LP.</w:t>
       </w:r>
     </w:p>
     <w:p>
@@ -567,7 +601,7 @@
         <w:pStyle w:val="Heading2"/>
         <w:spacing w:after="120" w:before="320"/>
       </w:pPr>
-      <w:hyperlink w:history="1" r:id="rIdpjsin855upm7-dzcwztsa">
+      <w:hyperlink w:history="1" r:id="rIdcnlxhiyxc0_3lmqnm0lpq">
         <w:r>
           <w:rPr>
             <w:b/>
@@ -689,7 +723,7 @@
           <w:sz w:val="20"/>
           <w:szCs w:val="20"/>
         </w:rPr>
-        <w:t xml:space="preserve">É a página institucional/comercial central do site — por isso recebe a maior prioridade de links internos (26), acima até das páginas de maior volume de busca.</w:t>
+        <w:t xml:space="preserve">É a página institucional/comercial central do site — por isso recebe a maior prioridade de links internos, acima até das páginas de maior volume de busca.</w:t>
       </w:r>
     </w:p>
     <w:p>
@@ -697,7 +731,7 @@
         <w:pStyle w:val="Heading2"/>
         <w:spacing w:after="120" w:before="320"/>
       </w:pPr>
-      <w:hyperlink w:history="1" r:id="rIddxiemksuolvomxtw_eo2x">
+      <w:hyperlink w:history="1" r:id="rIdmyo47dz89dtinnqtcpvyp">
         <w:r>
           <w:rPr>
             <w:b/>
@@ -775,7 +809,7 @@
           <w:sz w:val="20"/>
           <w:szCs w:val="20"/>
         </w:rPr>
-        <w:t xml:space="preserve">Tabela-resumo, custos reais (taxa MRV + nova Taxa de Integridade de Visto), tempo de espera por consulado (SP, Brasília, Rio, Recife, Porto Alegre).</w:t>
+        <w:t xml:space="preserve">Tabela-resumo, custos reais (taxa MRV + nova Taxa de Integridade de Visto), tempo de espera por consulado.</w:t>
       </w:r>
     </w:p>
     <w:p>
@@ -844,7 +878,7 @@
         <w:pStyle w:val="Heading2"/>
         <w:spacing w:after="120" w:before="320"/>
       </w:pPr>
-      <w:hyperlink w:history="1" r:id="rIdxziys4psplgfz8xz5gtli">
+      <w:hyperlink w:history="1" r:id="rIdik9joaijhelydokgm-c-q">
         <w:r>
           <w:rPr>
             <w:b/>
@@ -974,7 +1008,7 @@
         <w:pStyle w:val="Heading2"/>
         <w:spacing w:after="120" w:before="320"/>
       </w:pPr>
-      <w:hyperlink w:history="1" r:id="rIdlejpgpyzm7mamabfrnhwp">
+      <w:hyperlink w:history="1" r:id="rId_tgpwptuzyizhxyyyx-6i">
         <w:r>
           <w:rPr>
             <w:b/>
@@ -1087,7 +1121,7 @@
         <w:pStyle w:val="Heading2"/>
         <w:spacing w:after="120" w:before="320"/>
       </w:pPr>
-      <w:hyperlink w:history="1" r:id="rIdl4ar_-mpncbavcon-w-1f">
+      <w:hyperlink w:history="1" r:id="rId0rhy4fty-x143agn117zl">
         <w:r>
           <w:rPr>
             <w:b/>
@@ -1192,7 +1226,7 @@
           <w:sz w:val="20"/>
           <w:szCs w:val="20"/>
         </w:rPr>
-        <w:t xml:space="preserve">Decisão consciente: ensinar a preencher o DS-160 em detalhe seria dar de graça o serviço que a assessoria vende. A página captura o volume de busca sem concorrer com o próprio negócio.</w:t>
+        <w:t xml:space="preserve">Decisão consciente: ensinar a preencher o DS-160 em detalhe seria dar de graça o serviço que a assessoria vende.</w:t>
       </w:r>
     </w:p>
     <w:p>
@@ -1200,7 +1234,7 @@
         <w:pStyle w:val="Heading2"/>
         <w:spacing w:after="120" w:before="320"/>
       </w:pPr>
-      <w:hyperlink w:history="1" r:id="rIdtiwmb0kb6g7uhxitaqjs_">
+      <w:hyperlink w:history="1" r:id="rIdxte4gix5jqo2obtwyvwlf">
         <w:r>
           <w:rPr>
             <w:b/>
@@ -1313,7 +1347,7 @@
         <w:pStyle w:val="Heading2"/>
         <w:spacing w:after="120" w:before="320"/>
       </w:pPr>
-      <w:hyperlink w:history="1" r:id="rIdsywmqdx29mx-f0kx98vzw">
+      <w:hyperlink w:history="1" r:id="rId9i7qzefhzouknt6-33ttu">
         <w:r>
           <w:rPr>
             <w:b/>
@@ -1343,7 +1377,7 @@
           <w:sz w:val="20"/>
           <w:szCs w:val="20"/>
         </w:rPr>
-        <w:t xml:space="preserve">B1/B2 — o visto mais pedido por brasileiros (sem página dedicada até agora)</w:t>
+        <w:t xml:space="preserve">B1/B2 — o visto mais pedido por brasileiros</w:t>
       </w:r>
     </w:p>
     <w:p>
@@ -1443,7 +1477,7 @@
         <w:pStyle w:val="Heading2"/>
         <w:spacing w:after="120" w:before="320"/>
       </w:pPr>
-      <w:hyperlink w:history="1" r:id="rIdefplsrturkyayxkjs0ewc">
+      <w:hyperlink w:history="1" r:id="rIdhdxv6ladm0fhvepivf07e">
         <w:r>
           <w:rPr>
             <w:b/>
@@ -1473,7 +1507,7 @@
           <w:sz w:val="20"/>
           <w:szCs w:val="20"/>
         </w:rPr>
-        <w:t xml:space="preserve">F1 — visto de estudante (sem página dedicada até agora)</w:t>
+        <w:t xml:space="preserve">F1 — visto de estudante</w:t>
       </w:r>
     </w:p>
     <w:p>
@@ -1556,7 +1590,7 @@
         <w:pStyle w:val="Heading2"/>
         <w:spacing w:after="120" w:before="320"/>
       </w:pPr>
-      <w:hyperlink w:history="1" r:id="rIdcvn0uiwtnj34zakrf905k">
+      <w:hyperlink w:history="1" r:id="rIdlyh08nafeyuova-wd8raj">
         <w:r>
           <w:rPr>
             <w:b/>
@@ -1669,7 +1703,7 @@
         <w:pStyle w:val="Heading2"/>
         <w:spacing w:after="120" w:before="320"/>
       </w:pPr>
-      <w:hyperlink w:history="1" r:id="rIdsqcnrjpnkty6nqn-0qz8g">
+      <w:hyperlink w:history="1" r:id="rIdk3lijqytzrx2avth0qfgt">
         <w:r>
           <w:rPr>
             <w:b/>
@@ -1782,7 +1816,7 @@
         <w:pStyle w:val="Heading2"/>
         <w:spacing w:after="120" w:before="320"/>
       </w:pPr>
-      <w:hyperlink w:history="1" r:id="rIdgve8nqa0u13ori47ja5j8">
+      <w:hyperlink w:history="1" r:id="rIdxjyw4iqgylobewiuvwk4v">
         <w:r>
           <w:rPr>
             <w:b/>
@@ -1878,7 +1912,7 @@
         <w:pStyle w:val="Heading2"/>
         <w:spacing w:after="120" w:before="320"/>
       </w:pPr>
-      <w:hyperlink w:history="1" r:id="rIdvecwkqti9fnmohd1np0r9">
+      <w:hyperlink w:history="1" r:id="rIdimxtab9z-_khygucuuigc">
         <w:r>
           <w:rPr>
             <w:b/>
@@ -1991,7 +2025,7 @@
         <w:pStyle w:val="Heading2"/>
         <w:spacing w:after="120" w:before="320"/>
       </w:pPr>
-      <w:hyperlink w:history="1" r:id="rIddystzgyi93pfqq1vkaswx">
+      <w:hyperlink w:history="1" r:id="rIdthdgke7xg7rlizocuorp0">
         <w:r>
           <w:rPr>
             <w:b/>
@@ -2087,7 +2121,7 @@
         <w:pStyle w:val="Heading2"/>
         <w:spacing w:after="120" w:before="320"/>
       </w:pPr>
-      <w:hyperlink w:history="1" r:id="rId3teqj7vptdcrmxc2blwm7">
+      <w:hyperlink w:history="1" r:id="rIdrn6maaiwpxcytheguc5zt">
         <w:r>
           <w:rPr>
             <w:b/>
@@ -2267,6 +2301,40 @@
           <w:szCs w:val="20"/>
         </w:rPr>
         <w:t xml:space="preserve">Cluster fixo de links internos: as 6 páginas-núcleo aparecem em todas as LPs, mais 2 links contextuais específicos por página.</w:t>
+      </w:r>
+    </w:p>
+    <w:p>
+      <w:pPr>
+        <w:pStyle w:val="ListParagraph"/>
+        <w:numPr>
+          <w:ilvl w:val="0"/>
+          <w:numId w:val="2"/>
+        </w:numPr>
+        <w:spacing w:after="60"/>
+      </w:pPr>
+      <w:r>
+        <w:rPr>
+          <w:sz w:val="20"/>
+          <w:szCs w:val="20"/>
+        </w:rPr>
+        <w:t xml:space="preserve">Seção 'Guias sobre Visto Americano' na Home, com acesso direto às 8 principais LPs — reforça navegação e SEO interno sem criar páginas novas.</w:t>
+      </w:r>
+    </w:p>
+    <w:p>
+      <w:pPr>
+        <w:pStyle w:val="ListParagraph"/>
+        <w:numPr>
+          <w:ilvl w:val="0"/>
+          <w:numId w:val="2"/>
+        </w:numPr>
+        <w:spacing w:after="60"/>
+      </w:pPr>
+      <w:r>
+        <w:rPr>
+          <w:sz w:val="20"/>
+          <w:szCs w:val="20"/>
+        </w:rPr>
+        <w:t xml:space="preserve">Destaque institucional 'Suporte no Brasil e nos EUA', reforçando a credibilidade da marca.</w:t>
       </w:r>
     </w:p>
     <w:p>

</xml_diff>